<commit_message>
Close assignment rubric gaps: profile LI, optimizer benchmark, and report polish.
Add profile-likelihood CIs and MLE optimizer comparison, fix literature DOIs,
embed DVH/calibration figures in the assignment report with Vancouver refs,
auto-include notebook 02 when raw RTDOSE is present, and regenerate exports.
</commit_message>
<xml_diff>
--- a/reports/assignment_report.docx
+++ b/reports/assignment_report.docx
@@ -167,46 +167,6 @@
       <w:r>
         <w:t xml:space="preserve">2026-06-28</w:t>
       </w:r>
-      <w:r>
-        <w:br/>
-      </w:r>
-      <w:r>
-        <w:rPr>
-          <w:b/>
-          <w:bCs/>
-        </w:rPr>
-        <w:t xml:space="preserve">Verified numbers:</w:t>
-      </w:r>
-      <w:r>
-        <w:t xml:space="preserve"> </w:t>
-      </w:r>
-      <w:r>
-        <w:t xml:space="preserve">auto-generated</w:t>
-      </w:r>
-      <w:r>
-        <w:t xml:space="preserve"> </w:t>
-      </w:r>
-      <w:r>
-        <w:rPr>
-          <w:rStyle w:val="VerbatimChar"/>
-        </w:rPr>
-        <w:t xml:space="preserve">reports/RESULTS.md</w:t>
-      </w:r>
-      <w:r>
-        <w:t xml:space="preserve"> </w:t>
-      </w:r>
-      <w:r>
-        <w:t xml:space="preserve">(</w:t>
-      </w:r>
-      <w:r>
-        <w:rPr>
-          <w:rStyle w:val="VerbatimChar"/>
-        </w:rPr>
-        <w:t xml:space="preserve">make report</w:t>
-      </w:r>
-      <w:r>
-        <w:t xml:space="preserve">)</w:t>
-      </w:r>
     </w:p>
     <w:p>
       <w:r>
@@ -482,13 +442,13 @@
           <w:b/>
           <w:bCs/>
         </w:rPr>
-        <w:t xml:space="preserve">Primary project aim (assignment Parts I–VI):</w:t>
+        <w:t xml:space="preserve">Primary aim:</w:t>
       </w:r>
       <w:r>
         <w:t xml:space="preserve"> </w:t>
       </w:r>
       <w:r>
-        <w:t xml:space="preserve">build a reproducible TCP modeling pipeline on this open cohort, estimate D50 and gamma50 with uncertainty, compare models, and compare our parameters with published TCP literature.</w:t>
+        <w:t xml:space="preserve">build a reproducible TCP modeling pipeline on this open cohort, estimate D50 and gamma50 with uncertainty, compare models, and relate our parameters to published TCP literature.</w:t>
       </w:r>
     </w:p>
     <w:p>
@@ -1101,7 +1061,7 @@
         <w:t xml:space="preserve"> </w:t>
       </w:r>
       <w:r>
-        <w:t xml:space="preserve">only. CTV and PTV contours are</w:t>
+        <w:t xml:space="preserve">only. CTV and PTV contours are not included in the public CFB-GBM release (GTV-only segmentation). RTPLAN and RTSTRUCT DICOM objects are not distributed on TCIA Version 3; the cohort provides co-registered</w:t>
       </w:r>
       <w:r>
         <w:t xml:space="preserve"> </w:t>
@@ -1111,13 +1071,13 @@
           <w:b/>
           <w:bCs/>
         </w:rPr>
-        <w:t xml:space="preserve">not</w:t>
+        <w:t xml:space="preserve">RTDOSE</w:t>
       </w:r>
       <w:r>
         <w:t xml:space="preserve"> </w:t>
       </w:r>
       <w:r>
-        <w:t xml:space="preserve">included in the public CFB-GBM release (GTV-only segmentation). RTPLAN and RTSTRUCT DICOM objects are</w:t>
+        <w:t xml:space="preserve">and</w:t>
       </w:r>
       <w:r>
         <w:t xml:space="preserve"> </w:t>
@@ -1127,127 +1087,95 @@
           <w:b/>
           <w:bCs/>
         </w:rPr>
-        <w:t xml:space="preserve">not</w:t>
+        <w:t xml:space="preserve">GTV NIfTI</w:t>
       </w:r>
       <w:r>
         <w:t xml:space="preserve"> </w:t>
       </w:r>
       <w:r>
-        <w:t xml:space="preserve">distributed on TCIA Version 3; the assignment specification mentions DICOM-RT for institutional workflows, but this open cohort ships co-registered</w:t>
-      </w:r>
-      <w:r>
-        <w:t xml:space="preserve"> </w:t>
-      </w:r>
+        <w:t xml:space="preserve">volumes. D95, D98, D50, D2, gEUD, EQD2, and GTV volume were computed from voxel dose grids and binary masks—the same quantities typically exported from a treatment-planning system after structure delineation and dose calculation.</w:t>
+      </w:r>
+    </w:p>
+    <w:bookmarkEnd w:id="14"/>
+    <w:bookmarkStart w:id="15" w:name="cohort-flow-264-to-190"/>
+    <w:p>
+      <w:pPr>
+        <w:pStyle w:val="Heading3"/>
+      </w:pPr>
+      <w:r>
+        <w:rPr>
+          <w:rStyle w:val="SectionNumber"/>
+        </w:rPr>
+        <w:t xml:space="preserve">1.3.2</w:t>
+      </w:r>
+      <w:r>
+        <w:tab/>
+      </w:r>
+      <w:r>
+        <w:t xml:space="preserve">2.2 Cohort flow (264 to 190)</w:t>
+      </w:r>
+    </w:p>
+    <w:p>
+      <w:pPr>
+        <w:pStyle w:val="FirstParagraph"/>
+      </w:pPr>
+      <w:r>
+        <w:t xml:space="preserve">Starting from 264 patients in the clinical table, 70 were excluded because prescribed RT dose was unknown or missing. Among imaging-eligible patients, one patient failed DVH quality control (zero dose to GTV on RTDOSE). The final modeling table contains 190 rows and 58 columns (</w:t>
+      </w:r>
+      <w:r>
+        <w:rPr>
+          <w:rStyle w:val="VerbatimChar"/>
+        </w:rPr>
+        <w:t xml:space="preserve">modeling_table.csv</w:t>
+      </w:r>
+      <w:r>
+        <w:t xml:space="preserve">), including clinical covariates, DVH scalars, EQD2, RANO categories, and PyRadiomics merge keys. Notebook 01 (</w:t>
+      </w:r>
+      <w:r>
+        <w:rPr>
+          <w:rStyle w:val="VerbatimChar"/>
+        </w:rPr>
+        <w:t xml:space="preserve">01_cohort_overview.ipynb</w:t>
+      </w:r>
+      <w:r>
+        <w:t xml:space="preserve">) documents the full exclusion breakdown and demographic tables.</w:t>
+      </w:r>
+    </w:p>
+    <w:bookmarkEnd w:id="15"/>
+    <w:bookmarkStart w:id="16" w:name="outcome-definitions"/>
+    <w:p>
+      <w:pPr>
+        <w:pStyle w:val="Heading3"/>
+      </w:pPr>
+      <w:r>
+        <w:rPr>
+          <w:rStyle w:val="SectionNumber"/>
+        </w:rPr>
+        <w:t xml:space="preserve">1.3.3</w:t>
+      </w:r>
+      <w:r>
+        <w:tab/>
+      </w:r>
+      <w:r>
+        <w:t xml:space="preserve">2.3 Outcome definitions</w:t>
+      </w:r>
+    </w:p>
+    <w:p>
+      <w:pPr>
+        <w:pStyle w:val="FirstParagraph"/>
+      </w:pPr>
       <w:r>
         <w:rPr>
           <w:b/>
           <w:bCs/>
         </w:rPr>
-        <w:t xml:space="preserve">RTDOSE</w:t>
+        <w:t xml:space="preserve">Primary TCP endpoint (exploratory):</w:t>
       </w:r>
       <w:r>
         <w:t xml:space="preserve"> </w:t>
       </w:r>
       <w:r>
-        <w:t xml:space="preserve">and</w:t>
-      </w:r>
-      <w:r>
-        <w:t xml:space="preserve"> </w:t>
-      </w:r>
-      <w:r>
-        <w:rPr>
-          <w:b/>
-          <w:bCs/>
-        </w:rPr>
-        <w:t xml:space="preserve">GTV NIfTI</w:t>
-      </w:r>
-      <w:r>
-        <w:t xml:space="preserve"> </w:t>
-      </w:r>
-      <w:r>
-        <w:t xml:space="preserve">volumes instead. Our pipeline therefore computes D95, D98, D50, D2, gEUD, EQD2, and GTV volume directly from voxel dose grids and binary masks—functionally equivalent to DVH extraction from a DICOM plan once structures and dose are available.</w:t>
-      </w:r>
-    </w:p>
-    <w:bookmarkEnd w:id="14"/>
-    <w:bookmarkStart w:id="15" w:name="cohort-flow-264-to-190"/>
-    <w:p>
-      <w:pPr>
-        <w:pStyle w:val="Heading3"/>
-      </w:pPr>
-      <w:r>
-        <w:rPr>
-          <w:rStyle w:val="SectionNumber"/>
-        </w:rPr>
-        <w:t xml:space="preserve">1.3.2</w:t>
-      </w:r>
-      <w:r>
-        <w:tab/>
-      </w:r>
-      <w:r>
-        <w:t xml:space="preserve">2.2 Cohort flow (264 to 190)</w:t>
-      </w:r>
-    </w:p>
-    <w:p>
-      <w:pPr>
-        <w:pStyle w:val="FirstParagraph"/>
-      </w:pPr>
-      <w:r>
-        <w:t xml:space="preserve">Starting from 264 patients in the clinical table, 70 were excluded because prescribed RT dose was unknown or missing. Among imaging-eligible patients, one patient failed DVH quality control (zero dose to GTV on RTDOSE). The final modeling table contains 190 rows and 58 columns (</w:t>
-      </w:r>
-      <w:r>
-        <w:rPr>
-          <w:rStyle w:val="VerbatimChar"/>
-        </w:rPr>
-        <w:t xml:space="preserve">modeling_table.csv</w:t>
-      </w:r>
-      <w:r>
-        <w:t xml:space="preserve">), including clinical covariates, DVH scalars, EQD2, RANO categories, and PyRadiomics merge keys. Notebook 01 (</w:t>
-      </w:r>
-      <w:r>
-        <w:rPr>
-          <w:rStyle w:val="VerbatimChar"/>
-        </w:rPr>
-        <w:t xml:space="preserve">01_cohort_overview.ipynb</w:t>
-      </w:r>
-      <w:r>
-        <w:t xml:space="preserve">) documents the full exclusion breakdown and demographic tables.</w:t>
-      </w:r>
-    </w:p>
-    <w:bookmarkEnd w:id="15"/>
-    <w:bookmarkStart w:id="16" w:name="outcome-definitions"/>
-    <w:p>
-      <w:pPr>
-        <w:pStyle w:val="Heading3"/>
-      </w:pPr>
-      <w:r>
-        <w:rPr>
-          <w:rStyle w:val="SectionNumber"/>
-        </w:rPr>
-        <w:t xml:space="preserve">1.3.3</w:t>
-      </w:r>
-      <w:r>
-        <w:tab/>
-      </w:r>
-      <w:r>
-        <w:t xml:space="preserve">2.3 Outcome definitions</w:t>
-      </w:r>
-    </w:p>
-    <w:p>
-      <w:pPr>
-        <w:pStyle w:val="FirstParagraph"/>
-      </w:pPr>
-      <w:r>
-        <w:rPr>
-          <w:b/>
-          <w:bCs/>
-        </w:rPr>
-        <w:t xml:space="preserve">Primary TCP endpoint (exploratory):</w:t>
-      </w:r>
-      <w:r>
-        <w:t xml:space="preserve"> </w:t>
-      </w:r>
-      <w:r>
-        <w:t xml:space="preserve">OS greater than or equal to cohort median (51 weeks), used as a binary proxy for pipeline testing. This is not equivalent to formal tumour control.</w:t>
+        <w:t xml:space="preserve">OS greater than or equal to cohort median (51 weeks), used as a binary outcome for dose–response modeling. This is not equivalent to formal tumour control.</w:t>
       </w:r>
     </w:p>
     <w:p>
@@ -1475,7 +1403,15 @@
         </w:numPr>
       </w:pPr>
       <w:r>
-        <w:t xml:space="preserve">Fit TCP models, survival models, and RANO prediction suite; regenerate</w:t>
+        <w:t xml:space="preserve">Fit TCP models, survival models, and RANO prediction suite; export summary tables and figures.</w:t>
+      </w:r>
+    </w:p>
+    <w:p>
+      <w:pPr>
+        <w:pStyle w:val="FirstParagraph"/>
+      </w:pPr>
+      <w:r>
+        <w:t xml:space="preserve">All analysis code lives in</w:t>
       </w:r>
       <w:r>
         <w:t xml:space="preserve"> </w:t>
@@ -1484,104 +1420,26 @@
         <w:rPr>
           <w:rStyle w:val="VerbatimChar"/>
         </w:rPr>
-        <w:t xml:space="preserve">reports/RESULTS.md</w:t>
+        <w:t xml:space="preserve">src/</w:t>
+      </w:r>
+      <w:r>
+        <w:t xml:space="preserve">. Random seed 42 is fixed for bootstrap and cross-validation splits. Notebooks 01–06 reproduce the analysis end-to-end after</w:t>
       </w:r>
       <w:r>
         <w:t xml:space="preserve"> </w:t>
       </w:r>
       <w:r>
-        <w:t xml:space="preserve">via</w:t>
-      </w:r>
-      <w:r>
-        <w:t xml:space="preserve"> </w:t>
-      </w:r>
-      <w:r>
         <w:rPr>
           <w:rStyle w:val="VerbatimChar"/>
         </w:rPr>
-        <w:t xml:space="preserve">make report</w:t>
+        <w:t xml:space="preserve">pip install -r requirements.txt</w:t>
       </w:r>
       <w:r>
         <w:t xml:space="preserve">.</w:t>
       </w:r>
     </w:p>
-    <w:p>
-      <w:pPr>
-        <w:pStyle w:val="FirstParagraph"/>
-      </w:pPr>
-      <w:r>
-        <w:t xml:space="preserve">All analysis code lives in</w:t>
-      </w:r>
-      <w:r>
-        <w:t xml:space="preserve"> </w:t>
-      </w:r>
-      <w:r>
-        <w:rPr>
-          <w:rStyle w:val="VerbatimChar"/>
-        </w:rPr>
-        <w:t xml:space="preserve">src/</w:t>
-      </w:r>
-      <w:r>
-        <w:t xml:space="preserve">. Random seed 42 is fixed for bootstrap and cross-validation splits. Notebooks</w:t>
-      </w:r>
-      <w:r>
-        <w:t xml:space="preserve"> </w:t>
-      </w:r>
-      <w:r>
-        <w:rPr>
-          <w:b/>
-          <w:bCs/>
-        </w:rPr>
-        <w:t xml:space="preserve">01–06</w:t>
-      </w:r>
-      <w:r>
-        <w:t xml:space="preserve"> </w:t>
-      </w:r>
-      <w:r>
-        <w:t xml:space="preserve">execute top-to-bottom after</w:t>
-      </w:r>
-      <w:r>
-        <w:t xml:space="preserve"> </w:t>
-      </w:r>
-      <w:r>
-        <w:rPr>
-          <w:rStyle w:val="VerbatimChar"/>
-        </w:rPr>
-        <w:t xml:space="preserve">pip install -r requirements.txt</w:t>
-      </w:r>
-      <w:r>
-        <w:t xml:space="preserve"> </w:t>
-      </w:r>
-      <w:r>
-        <w:t xml:space="preserve">(</w:t>
-      </w:r>
-      <w:r>
-        <w:rPr>
-          <w:rStyle w:val="VerbatimChar"/>
-        </w:rPr>
-        <w:t xml:space="preserve">make check-notebooks</w:t>
-      </w:r>
-      <w:r>
-        <w:t xml:space="preserve">; notebook 02 runs automatically when</w:t>
-      </w:r>
-      <w:r>
-        <w:t xml:space="preserve"> </w:t>
-      </w:r>
-      <w:r>
-        <w:rPr>
-          <w:rStyle w:val="VerbatimChar"/>
-        </w:rPr>
-        <w:t xml:space="preserve">data/raw/</w:t>
-      </w:r>
-      <w:r>
-        <w:t xml:space="preserve"> </w:t>
-      </w:r>
-      <w:r>
-        <w:t xml:space="preserve">contains RTDOSE NIfTI).</w:t>
-      </w:r>
-    </w:p>
     <w:bookmarkEnd w:id="18"/>
-    <w:bookmarkStart w:id="19" w:name="nifti-vs-dicom-rt-assignment-part-i"/>
+    <w:bookmarkStart w:id="19" w:name="imaging-format-and-dvh-inputs"/>
     <w:p>
       <w:pPr>
         <w:pStyle w:val="Heading3"/>
@@ -1596,7 +1454,7 @@
         <w:tab/>
       </w:r>
       <w:r>
-        <w:t xml:space="preserve">3.3 NIfTI vs DICOM-RT (assignment Part I)</w:t>
+        <w:t xml:space="preserve">3.2 Imaging format and DVH inputs</w:t>
       </w:r>
     </w:p>
     <w:tbl>
@@ -1607,9 +1465,9 @@
         <w:tblLook w:firstRow="1" w:lastRow="0" w:firstColumn="0" w:lastColumn="0" w:noHBand="0" w:noVBand="0" w:val="0020"/>
       </w:tblPr>
       <w:tblGrid>
-        <w:gridCol w:w="3017"/>
-        <w:gridCol w:w="2388"/>
-        <w:gridCol w:w="2514"/>
+        <w:gridCol w:w="3686"/>
+        <w:gridCol w:w="2594"/>
+        <w:gridCol w:w="1638"/>
       </w:tblGrid>
       <w:tr>
         <w:trPr>
@@ -1623,7 +1481,7 @@
               <w:jc w:val="left"/>
             </w:pPr>
             <w:r>
-              <w:t xml:space="preserve">Assignment expectation</w:t>
+              <w:t xml:space="preserve">Typical DICOM-RT workflow</w:t>
             </w:r>
           </w:p>
         </w:tc>
@@ -1647,7 +1505,7 @@
               <w:jc w:val="left"/>
             </w:pPr>
             <w:r>
-              <w:t xml:space="preserve">Our implementation</w:t>
+              <w:t xml:space="preserve">This study</w:t>
             </w:r>
           </w:p>
         </w:tc>
@@ -1661,7 +1519,7 @@
               <w:jc w:val="left"/>
             </w:pPr>
             <w:r>
-              <w:t xml:space="preserve">DICOM-RT RTPLAN / RTSTRUCT</w:t>
+              <w:t xml:space="preserve">RTPLAN / RTSTRUCT</w:t>
             </w:r>
           </w:p>
         </w:tc>
@@ -1685,7 +1543,7 @@
               <w:jc w:val="left"/>
             </w:pPr>
             <w:r>
-              <w:t xml:space="preserve">N/A — use author NIfTI</w:t>
+              <w:t xml:space="preserve">RTDOSE + GTV NIfTI</w:t>
             </w:r>
           </w:p>
         </w:tc>
@@ -1723,10 +1581,6 @@
               <w:jc w:val="left"/>
             </w:pPr>
             <w:r>
-              <w:rPr>
-                <w:b/>
-                <w:bCs/>
-              </w:rPr>
               <w:t xml:space="preserve">GTV t0 only</w:t>
             </w:r>
           </w:p>
@@ -1818,7 +1672,7 @@
               <w:jc w:val="left"/>
             </w:pPr>
             <w:r>
-              <w:t xml:space="preserve">All exported to</w:t>
+              <w:t xml:space="preserve">Exported to</w:t>
             </w:r>
             <w:r>
               <w:t xml:space="preserve"> </w:t>
@@ -1832,73 +1686,13 @@
           </w:p>
         </w:tc>
       </w:tr>
-      <w:tr>
-        <w:tc>
-          <w:tcPr/>
-          <w:p>
-            <w:pPr>
-              <w:pStyle w:val="Compact"/>
-              <w:jc w:val="left"/>
-            </w:pPr>
-            <w:r>
-              <w:t xml:space="preserve">Optional DICOM path</w:t>
-            </w:r>
-          </w:p>
-        </w:tc>
-        <w:tc>
-          <w:tcPr/>
-          <w:p>
-            <w:pPr>
-              <w:pStyle w:val="Compact"/>
-              <w:jc w:val="left"/>
-            </w:pPr>
-            <w:r>
-              <w:t xml:space="preserve">—</w:t>
-            </w:r>
-          </w:p>
-        </w:tc>
-        <w:tc>
-          <w:tcPr/>
-          <w:p>
-            <w:pPr>
-              <w:pStyle w:val="Compact"/>
-              <w:jc w:val="left"/>
-            </w:pPr>
-            <w:r>
-              <w:rPr>
-                <w:rStyle w:val="VerbatimChar"/>
-              </w:rPr>
-              <w:t xml:space="preserve">src/data/download_rt_files.py</w:t>
-            </w:r>
-            <w:r>
-              <w:t xml:space="preserve"> </w:t>
-            </w:r>
-            <w:r>
-              <w:t xml:space="preserve">documents Aspera fetch; same metrics from NIfTI</w:t>
-            </w:r>
-          </w:p>
-        </w:tc>
-      </w:tr>
     </w:tbl>
     <w:p>
       <w:pPr>
         <w:pStyle w:val="BodyText"/>
       </w:pPr>
       <w:r>
-        <w:t xml:space="preserve">This is a</w:t>
-      </w:r>
-      <w:r>
-        <w:t xml:space="preserve"> </w:t>
-      </w:r>
-      <w:r>
-        <w:rPr>
-          <w:b/>
-          <w:bCs/>
-        </w:rPr>
-        <w:t xml:space="preserve">data-format limitation of the open cohort</w:t>
-      </w:r>
-      <w:r>
-        <w:t xml:space="preserve">, not an omission in the analysis code: given RTDOSE and GTV masks, cumulative DVH and standard metrics are identical to those derived from DICOM via a TPS export.</w:t>
+        <w:t xml:space="preserve">Given RTDOSE and GTV masks, cumulative DVH and standard metrics match those derived from a DICOM plan export.</w:t>
       </w:r>
     </w:p>
     <w:bookmarkEnd w:id="19"/>
@@ -1917,7 +1711,7 @@
         <w:tab/>
       </w:r>
       <w:r>
-        <w:t xml:space="preserve">3.2 EQD2 correction</w:t>
+        <w:t xml:space="preserve">3.3 EQD2 correction</w:t>
       </w:r>
     </w:p>
     <w:p>
@@ -2857,7 +2651,7 @@
         <w:t xml:space="preserve">). This is the standard choice for smooth, low-dimensional TCP likelihoods: fast convergence, explicit bounds, and stable gradients.</w:t>
       </w:r>
     </w:p>
-    <w:bookmarkStart w:id="28" w:name="why-l-bfgs-b-and-what-we-benchmarked"/>
+    <w:bookmarkStart w:id="28" w:name="maximum-likelihood-optimization"/>
     <w:p>
       <w:pPr>
         <w:pStyle w:val="Heading3"/>
@@ -2872,7 +2666,7 @@
         <w:tab/>
       </w:r>
       <w:r>
-        <w:t xml:space="preserve">5.1 Why L-BFGS-B and what we benchmarked</w:t>
+        <w:t xml:space="preserve">5.1 Maximum-likelihood optimization</w:t>
       </w:r>
     </w:p>
     <w:p>
@@ -2880,38 +2674,16 @@
         <w:pStyle w:val="FirstParagraph"/>
       </w:pPr>
       <w:r>
-        <w:t xml:space="preserve">The assignment asks for justified optimization. We did</w:t>
-      </w:r>
-      <w:r>
-        <w:t xml:space="preserve"> </w:t>
-      </w:r>
-      <w:r>
-        <w:rPr>
-          <w:b/>
-          <w:bCs/>
-        </w:rPr>
-        <w:t xml:space="preserve">not</w:t>
-      </w:r>
-      <w:r>
-        <w:t xml:space="preserve"> </w:t>
-      </w:r>
-      <w:r>
-        <w:t xml:space="preserve">default to derivative-free or global search methods because (i) the Poisson TCP negative log-likelihood is smooth in (D50, gamma50) for EQD2 doses in a bounded range; (ii) L-BFGS-B with clinically plausible bounds (D50 30–80 Gy, gamma50 0.5–8) converges reliably from multiple starts; (iii) production code must be deterministic and fast inside</w:t>
-      </w:r>
-      <w:r>
-        <w:t xml:space="preserve"> </w:t>
+        <w:t xml:space="preserve">Poisson TCP parameters were estimated by constrained maximum likelihood (</w:t>
       </w:r>
       <w:r>
         <w:rPr>
           <w:rStyle w:val="VerbatimChar"/>
         </w:rPr>
-        <w:t xml:space="preserve">make report</w:t>
-      </w:r>
-      <w:r>
-        <w:t xml:space="preserve"> </w:t>
-      </w:r>
-      <w:r>
-        <w:t xml:space="preserve">and bootstrap loops.</w:t>
+        <w:t xml:space="preserve">scipy.optimize.minimize</w:t>
+      </w:r>
+      <w:r>
+        <w:t xml:space="preserve">, method L-BFGS-B). For this smooth two-parameter likelihood, bounded quasi-Newton methods are appropriate: they converge quickly, respect clinically plausible bounds (D50 30–80 Gy, gamma50 0.5–8), and remain stable across bootstrap resamples.</w:t>
       </w:r>
     </w:p>
     <w:p>
@@ -2919,133 +2691,7 @@
         <w:pStyle w:val="BodyText"/>
       </w:pPr>
       <w:r>
-        <w:t xml:space="preserve">To document this choice,</w:t>
-      </w:r>
-      <w:r>
-        <w:t xml:space="preserve"> </w:t>
-      </w:r>
-      <w:r>
-        <w:rPr>
-          <w:rStyle w:val="VerbatimChar"/>
-        </w:rPr>
-        <w:t xml:space="preserve">src/analysis/mle_optimizer_benchmark.py</w:t>
-      </w:r>
-      <w:r>
-        <w:t xml:space="preserve"> </w:t>
-      </w:r>
-      <w:r>
-        <w:t xml:space="preserve">compares</w:t>
-      </w:r>
-      <w:r>
-        <w:t xml:space="preserve"> </w:t>
-      </w:r>
-      <w:r>
-        <w:rPr>
-          <w:b/>
-          <w:bCs/>
-        </w:rPr>
-        <w:t xml:space="preserve">L-BFGS-B</w:t>
-      </w:r>
-      <w:r>
-        <w:t xml:space="preserve"> </w:t>
-      </w:r>
-      <w:r>
-        <w:t xml:space="preserve">(production),</w:t>
-      </w:r>
-      <w:r>
-        <w:t xml:space="preserve"> </w:t>
-      </w:r>
-      <w:r>
-        <w:rPr>
-          <w:b/>
-          <w:bCs/>
-        </w:rPr>
-        <w:t xml:space="preserve">TNC</w:t>
-      </w:r>
-      <w:r>
-        <w:t xml:space="preserve">,</w:t>
-      </w:r>
-      <w:r>
-        <w:t xml:space="preserve"> </w:t>
-      </w:r>
-      <w:r>
-        <w:rPr>
-          <w:b/>
-          <w:bCs/>
-        </w:rPr>
-        <w:t xml:space="preserve">SLSQP</w:t>
-      </w:r>
-      <w:r>
-        <w:t xml:space="preserve">,</w:t>
-      </w:r>
-      <w:r>
-        <w:t xml:space="preserve"> </w:t>
-      </w:r>
-      <w:r>
-        <w:rPr>
-          <w:b/>
-          <w:bCs/>
-        </w:rPr>
-        <w:t xml:space="preserve">Powell</w:t>
-      </w:r>
-      <w:r>
-        <w:t xml:space="preserve">,</w:t>
-      </w:r>
-      <w:r>
-        <w:t xml:space="preserve"> </w:t>
-      </w:r>
-      <w:r>
-        <w:rPr>
-          <w:b/>
-          <w:bCs/>
-        </w:rPr>
-        <w:t xml:space="preserve">Nelder-Mead</w:t>
-      </w:r>
-      <w:r>
-        <w:t xml:space="preserve">, and</w:t>
-      </w:r>
-      <w:r>
-        <w:t xml:space="preserve"> </w:t>
-      </w:r>
-      <w:r>
-        <w:rPr>
-          <w:b/>
-          <w:bCs/>
-        </w:rPr>
-        <w:t xml:space="preserve">differential_evolution</w:t>
-      </w:r>
-      <w:r>
-        <w:t xml:space="preserve"> </w:t>
-      </w:r>
-      <w:r>
-        <w:t xml:space="preserve">on the same n = 190 cohort. All bounded methods recover the same D50 within 0.01 Gy; Nelder-Mead is slower and occasionally hits bound edges; differential evolution matches the MLE but costs ~10× more wall time. Results are written to</w:t>
-      </w:r>
-      <w:r>
-        <w:t xml:space="preserve"> </w:t>
-      </w:r>
-      <w:r>
-        <w:rPr>
-          <w:rStyle w:val="VerbatimChar"/>
-        </w:rPr>
-        <w:t xml:space="preserve">reports/metrics/mle_optimizer_benchmark.csv</w:t>
-      </w:r>
-      <w:r>
-        <w:t xml:space="preserve"> </w:t>
-      </w:r>
-      <w:r>
-        <w:t xml:space="preserve">on each</w:t>
-      </w:r>
-      <w:r>
-        <w:t xml:space="preserve"> </w:t>
-      </w:r>
-      <w:r>
-        <w:rPr>
-          <w:rStyle w:val="VerbatimChar"/>
-        </w:rPr>
-        <w:t xml:space="preserve">make report</w:t>
-      </w:r>
-      <w:r>
-        <w:t xml:space="preserve">.</w:t>
+        <w:t xml:space="preserve">We cross-checked the MLE with TNC, SLSQP, Powell, Nelder-Mead, and differential evolution on the full cohort (n = 190). All methods recovered D50 = 53.20 Gy within 0.002 Gy; Nelder-Mead and differential evolution required 2–20× more computation time without improving the fit.</w:t>
       </w:r>
     </w:p>
     <w:p>
@@ -3080,48 +2726,7 @@
         <w:pStyle w:val="FirstParagraph"/>
       </w:pPr>
       <w:r>
-        <w:t xml:space="preserve">Bootstrap 95% confidence intervals (1000 resamples, seed 42) were computed for Poisson D50 and gamma50 [18]. The assignment permits bootstrap</w:t>
-      </w:r>
-      <w:r>
-        <w:t xml:space="preserve"> </w:t>
-      </w:r>
-      <w:r>
-        <w:rPr>
-          <w:b/>
-          <w:bCs/>
-        </w:rPr>
-        <w:t xml:space="preserve">or</w:t>
-      </w:r>
-      <w:r>
-        <w:t xml:space="preserve"> </w:t>
-      </w:r>
-      <w:r>
-        <w:t xml:space="preserve">profile likelihood; we report</w:t>
-      </w:r>
-      <w:r>
-        <w:t xml:space="preserve"> </w:t>
-      </w:r>
-      <w:r>
-        <w:rPr>
-          <w:b/>
-          <w:bCs/>
-        </w:rPr>
-        <w:t xml:space="preserve">both</w:t>
-      </w:r>
-      <w:r>
-        <w:t xml:space="preserve"> </w:t>
-      </w:r>
-      <w:r>
-        <w:t xml:space="preserve">for D50 and gamma50: bootstrap captures finite-sample resampling uncertainty; profile likelihood uses the chi-square(1) threshold on the one-dimensional profile curves (</w:t>
-      </w:r>
-      <w:r>
-        <w:rPr>
-          <w:rStyle w:val="VerbatimChar"/>
-        </w:rPr>
-        <w:t xml:space="preserve">src/models/profile_likelihood_ci.py</w:t>
-      </w:r>
-      <w:r>
-        <w:t xml:space="preserve">), consistent with standard MLE theory.</w:t>
+        <w:t xml:space="preserve">Bootstrap 95% confidence intervals (1000 resamples, seed 42) and profile-likelihood 95% intervals were computed for Poisson D50 and gamma50 [18]. Bootstrap intervals reflect resampling uncertainty; profile likelihood uses the chi-square(1) threshold on one-dimensional profile curves, consistent with standard MLE theory.</w:t>
       </w:r>
     </w:p>
     <w:p>
@@ -3964,16 +3569,7 @@
         <w:pStyle w:val="BodyText"/>
       </w:pPr>
       <w:r>
-        <w:t xml:space="preserve">Profile and bootstrap intervals are similar in width; both exclude uninformative values (gamma50 &gt; 1). Optimizer benchmark (</w:t>
-      </w:r>
-      <w:r>
-        <w:rPr>
-          <w:rStyle w:val="VerbatimChar"/>
-        </w:rPr>
-        <w:t xml:space="preserve">reports/metrics/mle_optimizer_benchmark.csv</w:t>
-      </w:r>
-      <w:r>
-        <w:t xml:space="preserve">): L-BFGS-B, Powell, Nelder-Mead, SLSQP, and differential_evolution all recover D50 = 53.20 Gy within 0.002 Gy; Nelder-Mead and differential_evolution are 2–20× slower.</w:t>
+        <w:t xml:space="preserve">Profile and bootstrap intervals are similar in width; both exclude uninformative values (gamma50 &gt; 1).</w:t>
       </w:r>
     </w:p>
     <w:p>
@@ -4073,7 +3669,7 @@
         <w:t xml:space="preserve"> </w:t>
       </w:r>
       <w:r>
-        <w:t xml:space="preserve">Hosmer-Lemeshow groups (10 bins): observed fraction with OS &gt;= median vs mean predicted TCP per bin. HL p approximately 0.10 — acceptable for this exploratory endpoint; no systematic over/under-prediction across dose deciles. This satisfies assignment Part V (calibration + observed vs predicted).</w:t>
+        <w:t xml:space="preserve">Hosmer-Lemeshow groups (10 bins): observed fraction with OS &gt;= median vs mean predicted TCP per bin. HL p approximately 0.10; no systematic over- or under-prediction across dose deciles.</w:t>
       </w:r>
     </w:p>
     <w:p>
@@ -6387,7 +5983,7 @@
     </w:p>
     <w:bookmarkEnd w:id="76"/>
     <w:bookmarkEnd w:id="77"/>
-    <w:bookmarkStart w:id="80" w:name="X4b30b436ab51e9925679c7fdff9fbde02747be5"/>
+    <w:bookmarkStart w:id="80" w:name="X313ef0aabee60378cdc876fab7425d5ab472a3a"/>
     <w:p>
       <w:pPr>
         <w:pStyle w:val="Heading2"/>
@@ -6402,7 +5998,7 @@
         <w:tab/>
       </w:r>
       <w:r>
-        <w:t xml:space="preserve">9. Literature Review and TCP Parameter Comparison (Assignment Part VI)</w:t>
+        <w:t xml:space="preserve">9. Literature Review and TCP Parameter Comparison</w:t>
       </w:r>
     </w:p>
     <w:p>
@@ -7479,23 +7075,25 @@
         <w:pStyle w:val="FirstParagraph"/>
       </w:pPr>
       <w:r>
-        <w:t xml:space="preserve">We delivered an open, reproducible TCP modeling pipeline on the CFB-GBM cohort and completed all core assignment components: DVH extraction (NIfTI-based, GTV-only), four TCP models,</w:t>
-      </w:r>
-      <w:r>
-        <w:t xml:space="preserve"> </w:t>
-      </w:r>
+        <w:t xml:space="preserve">We implemented a reproducible TCP modeling workflow on the CFB-GBM cohort: NIfTI-based DVH extraction (GTV only), four TCP model families, bootstrap and profile-likelihood uncertainty intervals, model comparison (AIC, BIC, ROC, Brier), calibration assessment, survival analysis, literature comparison of D50 and gamma50, and RANO/PyRadiomics prediction with nested cross-validation.</w:t>
+      </w:r>
+    </w:p>
+    <w:p>
+      <w:pPr>
+        <w:pStyle w:val="BodyText"/>
+      </w:pPr>
       <w:r>
         <w:rPr>
           <w:b/>
           <w:bCs/>
         </w:rPr>
-        <w:t xml:space="preserve">bootstrap and profile-likelihood</w:t>
+        <w:t xml:space="preserve">Classical pooled TCP dose-response validation is not feasible</w:t>
       </w:r>
       <w:r>
         <w:t xml:space="preserve"> </w:t>
       </w:r>
       <w:r>
-        <w:t xml:space="preserve">confidence intervals,</w:t>
+        <w:t xml:space="preserve">on this routine-care dataset. With confounding addressed,</w:t>
       </w:r>
       <w:r>
         <w:t xml:space="preserve"> </w:t>
@@ -7505,72 +7103,13 @@
           <w:b/>
           <w:bCs/>
         </w:rPr>
-        <w:t xml:space="preserve">documented MLE optimization</w:t>
+        <w:t xml:space="preserve">tumour burden metrics</w:t>
       </w:r>
       <w:r>
         <w:t xml:space="preserve"> </w:t>
       </w:r>
       <w:r>
-        <w:t xml:space="preserve">(L-BFGS-B with multi-method benchmark), model comparison (AIC/BIC/ROC/Brier),</w:t>
-      </w:r>
-      <w:r>
-        <w:t xml:space="preserve"> </w:t>
-      </w:r>
-      <w:r>
-        <w:rPr>
-          <w:b/>
-          <w:bCs/>
-        </w:rPr>
-        <w:t xml:space="preserve">calibration figures</w:t>
-      </w:r>
-      <w:r>
-        <w:t xml:space="preserve">, survival analysis, literature TCP parameter comparison, and Version 3 RANO/PyRadiomics extensions with nested cross-validation.</w:t>
-      </w:r>
-    </w:p>
-    <w:p>
-      <w:pPr>
-        <w:pStyle w:val="BodyText"/>
-      </w:pPr>
-      <w:r>
-        <w:rPr>
-          <w:b/>
-          <w:bCs/>
-        </w:rPr>
-        <w:t xml:space="preserve">Classical pooled TCP dose-response validation is not feasible</w:t>
-      </w:r>
-      <w:r>
-        <w:t xml:space="preserve"> </w:t>
-      </w:r>
-      <w:r>
-        <w:t xml:space="preserve">on this routine-care dataset. With confounding addressed,</w:t>
-      </w:r>
-      <w:r>
-        <w:t xml:space="preserve"> </w:t>
-      </w:r>
-      <w:r>
-        <w:rPr>
-          <w:b/>
-          <w:bCs/>
-        </w:rPr>
-        <w:t xml:space="preserve">tumour burden metrics</w:t>
-      </w:r>
-      <w:r>
-        <w:t xml:space="preserve"> </w:t>
-      </w:r>
-      <w:r>
-        <w:t xml:space="preserve">(GTV volume and selected PyRadiomics features) predict early RANO with moderate out-of-sample discrimination. All figures, tables, and numeric results regenerate from committed code via</w:t>
-      </w:r>
-      <w:r>
-        <w:t xml:space="preserve"> </w:t>
-      </w:r>
-      <w:r>
-        <w:rPr>
-          <w:rStyle w:val="VerbatimChar"/>
-        </w:rPr>
-        <w:t xml:space="preserve">make report</w:t>
-      </w:r>
-      <w:r>
-        <w:t xml:space="preserve">.</w:t>
+        <w:t xml:space="preserve">(GTV volume and selected PyRadiomics features) predict early RANO with moderate out-of-sample discrimination.</w:t>
       </w:r>
     </w:p>
     <w:p>
@@ -7581,7 +7120,7 @@
       </w:r>
     </w:p>
     <w:bookmarkEnd w:id="86"/>
-    <w:bookmarkStart w:id="87" w:name="references-vancouver-style"/>
+    <w:bookmarkStart w:id="87" w:name="references"/>
     <w:p>
       <w:pPr>
         <w:pStyle w:val="Heading2"/>
@@ -7596,7 +7135,7 @@
         <w:tab/>
       </w:r>
       <w:r>
-        <w:t xml:space="preserve">References (Vancouver style)</w:t>
+        <w:t xml:space="preserve">References</w:t>
       </w:r>
     </w:p>
     <w:p>
@@ -7888,7 +7427,7 @@
       </w:r>
     </w:p>
     <w:bookmarkEnd w:id="88"/>
-    <w:bookmarkStart w:id="89" w:name="appendix-b-repository-deliverables"/>
+    <w:bookmarkStart w:id="89" w:name="appendix-b-repository-outputs"/>
     <w:p>
       <w:pPr>
         <w:pStyle w:val="Heading2"/>
@@ -7903,7 +7442,7 @@
         <w:tab/>
       </w:r>
       <w:r>
-        <w:t xml:space="preserve">Appendix B — Repository deliverables</w:t>
+        <w:t xml:space="preserve">Appendix B — Repository outputs</w:t>
       </w:r>
     </w:p>
     <w:tbl>
@@ -7928,7 +7467,7 @@
               <w:jc w:val="left"/>
             </w:pPr>
             <w:r>
-              <w:t xml:space="preserve">Deliverable</w:t>
+              <w:t xml:space="preserve">Output</w:t>
             </w:r>
           </w:p>
         </w:tc>
@@ -7980,7 +7519,7 @@
               <w:jc w:val="left"/>
             </w:pPr>
             <w:r>
-              <w:t xml:space="preserve">Auto results</w:t>
+              <w:t xml:space="preserve">Summary results</w:t>
             </w:r>
           </w:p>
         </w:tc>
@@ -8006,7 +7545,7 @@
               <w:jc w:val="left"/>
             </w:pPr>
             <w:r>
-              <w:t xml:space="preserve">Assignment report (this document)</w:t>
+              <w:t xml:space="preserve">This report (PDF)</w:t>
             </w:r>
           </w:p>
         </w:tc>

</xml_diff>